<commit_message>
user need to know
</commit_message>
<xml_diff>
--- a/其他更新计划.docx
+++ b/其他更新计划.docx
@@ -9,6 +9,49 @@
           <w:lang w:val="en-US" w:eastAsia="zh-CN"/>
         </w:rPr>
       </w:pPr>
+      <w:r>
+        <w:rPr>
+          <w:rFonts w:ascii="Segoe UI" w:hAnsi="Segoe UI" w:eastAsia="Segoe UI" w:cs="Segoe UI"/>
+          <w:b/>
+          <w:i w:val="0"/>
+          <w:caps w:val="0"/>
+          <w:color w:val="D4D4D4"/>
+          <w:spacing w:val="0"/>
+          <w:sz w:val="11"/>
+          <w:szCs w:val="11"/>
+          <w:shd w:val="clear" w:fill="1E1E1E"/>
+        </w:rPr>
+        <w:t>任务级</w:t>
+      </w:r>
+      <w:r>
+        <w:rPr>
+          <w:rFonts w:hint="eastAsia" w:ascii="Segoe UI" w:hAnsi="Segoe UI" w:eastAsia="宋体" w:cs="Segoe UI"/>
+          <w:b/>
+          <w:i w:val="0"/>
+          <w:caps w:val="0"/>
+          <w:color w:val="D4D4D4"/>
+          <w:spacing w:val="0"/>
+          <w:sz w:val="11"/>
+          <w:szCs w:val="11"/>
+          <w:shd w:val="clear" w:fill="1E1E1E"/>
+          <w:lang w:val="en-US" w:eastAsia="zh-CN"/>
+        </w:rPr>
+        <w:t>删改</w:t>
+      </w:r>
+      <w:r>
+        <w:rPr>
+          <w:rFonts w:ascii="Segoe UI" w:hAnsi="Segoe UI" w:eastAsia="Segoe UI" w:cs="Segoe UI"/>
+          <w:b/>
+          <w:i w:val="0"/>
+          <w:caps w:val="0"/>
+          <w:color w:val="D4D4D4"/>
+          <w:spacing w:val="0"/>
+          <w:sz w:val="11"/>
+          <w:szCs w:val="11"/>
+          <w:shd w:val="clear" w:fill="1E1E1E"/>
+        </w:rPr>
+        <w:t>密钥</w:t>
+      </w:r>
       <w:bookmarkStart w:id="0" w:name="_GoBack"/>
       <w:bookmarkEnd w:id="0"/>
     </w:p>

</xml_diff>

<commit_message>
gray button     waitress bug fix
</commit_message>
<xml_diff>
--- a/其他更新计划.docx
+++ b/其他更新计划.docx
@@ -29,10 +29,68 @@
       <w:pPr>
         <w:bidi w:val="0"/>
         <w:rPr>
-          <w:rFonts w:hint="default"/>
+          <w:rFonts w:hint="eastAsia" w:eastAsiaTheme="minorEastAsia"/>
           <w:lang w:val="en-US" w:eastAsia="zh-CN"/>
         </w:rPr>
       </w:pPr>
+      <w:r>
+        <w:drawing>
+          <wp:anchor distT="0" distB="0" distL="114300" distR="114300" simplePos="0" relativeHeight="251659264" behindDoc="0" locked="0" layoutInCell="1" allowOverlap="1">
+            <wp:simplePos x="0" y="0"/>
+            <wp:positionH relativeFrom="column">
+              <wp:posOffset>-41275</wp:posOffset>
+            </wp:positionH>
+            <wp:positionV relativeFrom="paragraph">
+              <wp:posOffset>372745</wp:posOffset>
+            </wp:positionV>
+            <wp:extent cx="4977765" cy="2271395"/>
+            <wp:effectExtent l="0" t="0" r="5715" b="14605"/>
+            <wp:wrapTopAndBottom/>
+            <wp:docPr id="1" name="图片 2"/>
+            <wp:cNvGraphicFramePr>
+              <a:graphicFrameLocks xmlns:a="http://schemas.openxmlformats.org/drawingml/2006/main" noChangeAspect="1"/>
+            </wp:cNvGraphicFramePr>
+            <a:graphic xmlns:a="http://schemas.openxmlformats.org/drawingml/2006/main">
+              <a:graphicData uri="http://schemas.openxmlformats.org/drawingml/2006/picture">
+                <pic:pic xmlns:pic="http://schemas.openxmlformats.org/drawingml/2006/picture">
+                  <pic:nvPicPr>
+                    <pic:cNvPr id="1" name="图片 2"/>
+                    <pic:cNvPicPr>
+                      <a:picLocks noChangeAspect="1"/>
+                    </pic:cNvPicPr>
+                  </pic:nvPicPr>
+                  <pic:blipFill>
+                    <a:blip r:embed="rId4"/>
+                    <a:stretch>
+                      <a:fillRect/>
+                    </a:stretch>
+                  </pic:blipFill>
+                  <pic:spPr>
+                    <a:xfrm>
+                      <a:off x="0" y="0"/>
+                      <a:ext cx="4977765" cy="2271395"/>
+                    </a:xfrm>
+                    <a:prstGeom prst="rect">
+                      <a:avLst/>
+                    </a:prstGeom>
+                    <a:noFill/>
+                    <a:ln>
+                      <a:noFill/>
+                    </a:ln>
+                  </pic:spPr>
+                </pic:pic>
+              </a:graphicData>
+            </a:graphic>
+          </wp:anchor>
+        </w:drawing>
+      </w:r>
+      <w:r>
+        <w:rPr>
+          <w:rFonts w:hint="eastAsia"/>
+          <w:lang w:val="en-US" w:eastAsia="zh-CN"/>
+        </w:rPr>
+        <w:t>毛玻璃按钮</w:t>
+      </w:r>
       <w:bookmarkStart w:id="0" w:name="_GoBack"/>
       <w:bookmarkEnd w:id="0"/>
     </w:p>
@@ -47,13 +105,14 @@
 </file>
 
 <file path=word/styles.xml><?xml version="1.0" encoding="utf-8"?>
-<w:styles xmlns:mc="http://schemas.openxmlformats.org/markup-compatibility/2006" xmlns:o="urn:schemas-microsoft-com:office:office" xmlns:r="http://schemas.openxmlformats.org/officeDocument/2006/relationships" xmlns:m="http://schemas.openxmlformats.org/officeDocument/2006/math" xmlns:v="urn:schemas-microsoft-com:vml" xmlns:w="http://schemas.openxmlformats.org/wordprocessingml/2006/main" xmlns:w14="http://schemas.microsoft.com/office/word/2010/wordml" xmlns:w10="urn:schemas-microsoft-com:office:word" xmlns:sl="http://schemas.openxmlformats.org/schemaLibrary/2006/main" mc:Ignorable="w14">
+<w:styles xmlns:mc="http://schemas.openxmlformats.org/markup-compatibility/2006" xmlns:o="urn:schemas-microsoft-com:office:office" xmlns:r="http://schemas.openxmlformats.org/officeDocument/2006/relationships" xmlns:m="http://schemas.openxmlformats.org/officeDocument/2006/math" xmlns:v="urn:schemas-microsoft-com:vml" xmlns:w="http://schemas.openxmlformats.org/wordprocessingml/2006/main" xmlns:w14="http://schemas.microsoft.com/office/word/2010/wordml" xmlns:w10="urn:schemas-microsoft-com:office:word" xmlns:sl="http://schemas.openxmlformats.org/schemaLibrary/2006/main" xmlns:wpsCustomData="http://www.wps.cn/officeDocument/2013/wpsCustomData" mc:Ignorable="w14">
   <w:docDefaults>
     <w:rPrDefault>
       <w:rPr>
         <w:rFonts w:ascii="Times New Roman" w:hAnsi="Times New Roman" w:eastAsia="宋体" w:cs="Times New Roman"/>
       </w:rPr>
     </w:rPrDefault>
+    <w:pPrDefault/>
   </w:docDefaults>
   <w:latentStyles w:count="260" w:defQFormat="0" w:defUnhideWhenUsed="1" w:defSemiHidden="1" w:defUIPriority="99" w:defLockedState="0">
     <w:lsdException w:qFormat="1" w:unhideWhenUsed="0" w:uiPriority="0" w:semiHidden="0" w:name="Normal"/>
@@ -646,20 +705,4 @@
   </a:themeElements>
   <a:objectDefaults/>
 </a:theme>
-</file>
-
-<file path=customXml/item1.xml><?xml version="1.0" encoding="utf-8"?>
-<s:customData xmlns="http://www.wps.cn/officeDocument/2013/wpsCustomData" xmlns:s="http://www.wps.cn/officeDocument/2013/wpsCustomData">
-  <customSectProps>
-    <customSectPr/>
-  </customSectProps>
-</s:customData>
-</file>
-
-<file path=customXml/itemProps1.xml><?xml version="1.0" encoding="utf-8"?>
-<ds:datastoreItem xmlns:ds="http://schemas.openxmlformats.org/officeDocument/2006/customXml" ds:itemID="{B1977F7D-205B-4081-913C-38D41E755F92}">
-  <ds:schemaRefs>
-    <ds:schemaRef ds:uri="http://www.wps.cn/officeDocument/2013/wpsCustomData"/>
-  </ds:schemaRefs>
-</ds:datastoreItem>
 </file>
</xml_diff>

<commit_message>
guide taskdetail bugfix ui update
</commit_message>
<xml_diff>
--- a/其他更新计划.docx
+++ b/其他更新计划.docx
@@ -85,21 +85,7 @@
           <w:szCs w:val="16"/>
           <w:lang w:val="en-US" w:eastAsia="zh-CN" w:bidi="ar"/>
         </w:rPr>
-        <w:t>对此解决：由于一个任务可以上传多个html，因此该用户的建议不直接可行，但是可以通过在“删改任务”时添加按钮实现，按钮内容“替换原有文件，保留URL不变”</w:t>
-      </w:r>
-      <w:r>
-        <w:rPr>
-          <w:rFonts w:hint="eastAsia" w:ascii="Segoe UI" w:hAnsi="Segoe UI" w:eastAsia="Segoe UI" w:cs="Segoe UI"/>
-          <w:i w:val="0"/>
-          <w:caps w:val="0"/>
-          <w:color w:val="FF0000"/>
-          <w:spacing w:val="0"/>
-          <w:kern w:val="0"/>
-          <w:sz w:val="16"/>
-          <w:szCs w:val="16"/>
-          <w:lang w:val="en-US" w:eastAsia="zh-CN" w:bidi="ar"/>
-        </w:rPr>
-        <w:t>？的逻辑实现</w:t>
+        <w:t>对此解决：由于一个任务可以上传多个html，因此该用户的建议不直接可行，但是可以通过在“删改任务”时添加按钮实现，按钮内容“替换原有文件，保留URL不变”？的逻辑实现</w:t>
       </w:r>
     </w:p>
     <w:p>
@@ -110,6 +96,194 @@
           <w:lang w:val="en-US" w:eastAsia="zh-CN"/>
         </w:rPr>
       </w:pPr>
+    </w:p>
+    <w:p>
+      <w:pPr>
+        <w:bidi w:val="0"/>
+        <w:rPr>
+          <w:rFonts w:hint="default" w:ascii="Segoe UI" w:hAnsi="Segoe UI" w:eastAsia="Segoe UI" w:cs="Segoe UI"/>
+          <w:i w:val="0"/>
+          <w:caps w:val="0"/>
+          <w:color w:val="055160"/>
+          <w:spacing w:val="0"/>
+          <w:sz w:val="13"/>
+          <w:szCs w:val="13"/>
+          <w:shd w:val="clear" w:fill="CFF4FC"/>
+        </w:rPr>
+      </w:pPr>
+      <w:r>
+        <w:rPr>
+          <w:rFonts w:ascii="Segoe UI" w:hAnsi="Segoe UI" w:eastAsia="Segoe UI" w:cs="Segoe UI"/>
+          <w:i w:val="0"/>
+          <w:caps w:val="0"/>
+          <w:color w:val="055160"/>
+          <w:spacing w:val="0"/>
+          <w:sz w:val="13"/>
+          <w:szCs w:val="13"/>
+          <w:shd w:val="clear" w:fill="CFF4FC"/>
+        </w:rPr>
+        <w:t>尚未上传HTML文件。如需上传，请前往</w:t>
+      </w:r>
+      <w:r>
+        <w:rPr>
+          <w:rFonts w:hint="default" w:ascii="Segoe UI" w:hAnsi="Segoe UI" w:eastAsia="Segoe UI" w:cs="Segoe UI"/>
+          <w:i w:val="0"/>
+          <w:caps w:val="0"/>
+          <w:color w:val="055160"/>
+          <w:spacing w:val="0"/>
+          <w:sz w:val="13"/>
+          <w:szCs w:val="13"/>
+          <w:shd w:val="clear" w:fill="CFF4FC"/>
+        </w:rPr>
+        <w:t> </w:t>
+      </w:r>
+      <w:r>
+        <w:rPr>
+          <w:rFonts w:hint="default" w:ascii="Segoe UI" w:hAnsi="Segoe UI" w:eastAsia="Segoe UI" w:cs="Segoe UI"/>
+          <w:b/>
+          <w:i w:val="0"/>
+          <w:caps w:val="0"/>
+          <w:color w:val="055160"/>
+          <w:spacing w:val="0"/>
+          <w:sz w:val="13"/>
+          <w:szCs w:val="13"/>
+          <w:u w:val="single"/>
+          <w:shd w:val="clear" w:fill="CFF4FC"/>
+        </w:rPr>
+        <w:fldChar w:fldCharType="begin"/>
+      </w:r>
+      <w:r>
+        <w:rPr>
+          <w:rFonts w:hint="default" w:ascii="Segoe UI" w:hAnsi="Segoe UI" w:eastAsia="Segoe UI" w:cs="Segoe UI"/>
+          <w:b/>
+          <w:i w:val="0"/>
+          <w:caps w:val="0"/>
+          <w:color w:val="055160"/>
+          <w:spacing w:val="0"/>
+          <w:sz w:val="13"/>
+          <w:szCs w:val="13"/>
+          <w:u w:val="single"/>
+          <w:shd w:val="clear" w:fill="CFF4FC"/>
+        </w:rPr>
+        <w:instrText xml:space="preserve"> HYPERLINK "https://quickform.cn/edit_task/14380" </w:instrText>
+      </w:r>
+      <w:r>
+        <w:rPr>
+          <w:rFonts w:hint="default" w:ascii="Segoe UI" w:hAnsi="Segoe UI" w:eastAsia="Segoe UI" w:cs="Segoe UI"/>
+          <w:b/>
+          <w:i w:val="0"/>
+          <w:caps w:val="0"/>
+          <w:color w:val="055160"/>
+          <w:spacing w:val="0"/>
+          <w:sz w:val="13"/>
+          <w:szCs w:val="13"/>
+          <w:u w:val="single"/>
+          <w:shd w:val="clear" w:fill="CFF4FC"/>
+        </w:rPr>
+        <w:fldChar w:fldCharType="separate"/>
+      </w:r>
+      <w:r>
+        <w:rPr>
+          <w:rStyle w:val="7"/>
+          <w:rFonts w:hint="default" w:ascii="Segoe UI" w:hAnsi="Segoe UI" w:eastAsia="Segoe UI" w:cs="Segoe UI"/>
+          <w:b/>
+          <w:i w:val="0"/>
+          <w:caps w:val="0"/>
+          <w:color w:val="055160"/>
+          <w:spacing w:val="0"/>
+          <w:sz w:val="13"/>
+          <w:szCs w:val="13"/>
+          <w:u w:val="single"/>
+          <w:shd w:val="clear" w:fill="CFF4FC"/>
+        </w:rPr>
+        <w:t>编辑任务</w:t>
+      </w:r>
+      <w:r>
+        <w:rPr>
+          <w:rFonts w:hint="default" w:ascii="Segoe UI" w:hAnsi="Segoe UI" w:eastAsia="Segoe UI" w:cs="Segoe UI"/>
+          <w:b/>
+          <w:i w:val="0"/>
+          <w:caps w:val="0"/>
+          <w:color w:val="055160"/>
+          <w:spacing w:val="0"/>
+          <w:sz w:val="13"/>
+          <w:szCs w:val="13"/>
+          <w:u w:val="single"/>
+          <w:shd w:val="clear" w:fill="CFF4FC"/>
+        </w:rPr>
+        <w:fldChar w:fldCharType="end"/>
+      </w:r>
+      <w:r>
+        <w:rPr>
+          <w:rFonts w:hint="default" w:ascii="Segoe UI" w:hAnsi="Segoe UI" w:eastAsia="Segoe UI" w:cs="Segoe UI"/>
+          <w:i w:val="0"/>
+          <w:caps w:val="0"/>
+          <w:color w:val="055160"/>
+          <w:spacing w:val="0"/>
+          <w:sz w:val="13"/>
+          <w:szCs w:val="13"/>
+          <w:shd w:val="clear" w:fill="CFF4FC"/>
+        </w:rPr>
+        <w:t> 页面。</w:t>
+      </w:r>
+    </w:p>
+    <w:p>
+      <w:pPr>
+        <w:bidi w:val="0"/>
+        <w:rPr>
+          <w:rFonts w:hint="default" w:ascii="Segoe UI" w:hAnsi="Segoe UI" w:eastAsia="宋体" w:cs="Segoe UI"/>
+          <w:i w:val="0"/>
+          <w:caps w:val="0"/>
+          <w:color w:val="055160"/>
+          <w:spacing w:val="0"/>
+          <w:sz w:val="13"/>
+          <w:szCs w:val="13"/>
+          <w:shd w:val="clear" w:fill="CFF4FC"/>
+          <w:lang w:val="en-US" w:eastAsia="zh-CN"/>
+        </w:rPr>
+      </w:pPr>
+      <w:r>
+        <w:rPr>
+          <w:rFonts w:hint="eastAsia" w:ascii="Segoe UI" w:hAnsi="Segoe UI" w:eastAsia="宋体" w:cs="Segoe UI"/>
+          <w:i w:val="0"/>
+          <w:caps w:val="0"/>
+          <w:color w:val="055160"/>
+          <w:spacing w:val="0"/>
+          <w:sz w:val="13"/>
+          <w:szCs w:val="13"/>
+          <w:shd w:val="clear" w:fill="CFF4FC"/>
+          <w:lang w:val="en-US" w:eastAsia="zh-CN"/>
+        </w:rPr>
+        <w:t>这段文字描述修改为：</w:t>
+      </w:r>
+      <w:r>
+        <w:rPr>
+          <w:rFonts w:hint="eastAsia" w:ascii="Segoe UI" w:hAnsi="Segoe UI" w:eastAsia="宋体" w:cs="Segoe UI"/>
+          <w:i w:val="0"/>
+          <w:caps w:val="0"/>
+          <w:color w:val="055160"/>
+          <w:spacing w:val="0"/>
+          <w:sz w:val="13"/>
+          <w:szCs w:val="13"/>
+          <w:shd w:val="clear" w:fill="CFF4FC"/>
+          <w:lang w:val="en-US" w:eastAsia="zh-CN"/>
+        </w:rPr>
+        <w:br w:type="textWrapping"/>
+      </w:r>
+      <w:r>
+        <w:rPr>
+          <w:rFonts w:hint="eastAsia" w:ascii="Segoe UI" w:hAnsi="Segoe UI" w:eastAsia="宋体" w:cs="Segoe UI"/>
+          <w:i w:val="0"/>
+          <w:caps w:val="0"/>
+          <w:color w:val="055160"/>
+          <w:spacing w:val="0"/>
+          <w:sz w:val="13"/>
+          <w:szCs w:val="13"/>
+          <w:shd w:val="clear" w:fill="CFF4FC"/>
+          <w:lang w:val="en-US" w:eastAsia="zh-CN"/>
+        </w:rPr>
+        <w:t>如果想要让自己的网页在互联网</w:t>
+      </w:r>
       <w:bookmarkStart w:id="0" w:name="_GoBack"/>
       <w:bookmarkEnd w:id="0"/>
     </w:p>
@@ -124,9 +298,220 @@
     </w:p>
     <w:p>
       <w:pPr>
-        <w:bidi w:val="0"/>
-        <w:rPr>
-          <w:rFonts w:hint="eastAsia"/>
+        <w:pStyle w:val="3"/>
+        <w:keepNext w:val="0"/>
+        <w:keepLines w:val="0"/>
+        <w:widowControl/>
+        <w:suppressLineNumbers w:val="0"/>
+        <w:shd w:val="clear" w:fill="FFFFFF"/>
+        <w:spacing w:before="0" w:beforeAutospacing="0" w:after="0" w:afterAutospacing="0" w:line="10" w:lineRule="atLeast"/>
+        <w:ind w:left="0" w:firstLine="0"/>
+        <w:rPr>
+          <w:rFonts w:hint="eastAsia" w:ascii="Segoe UI" w:hAnsi="Segoe UI" w:cs="Segoe UI"/>
+          <w:b/>
+          <w:i w:val="0"/>
+          <w:caps w:val="0"/>
+          <w:color w:val="0000FF"/>
+          <w:spacing w:val="0"/>
+          <w:shd w:val="clear" w:fill="FFFFFF"/>
+          <w:lang w:val="en-US" w:eastAsia="zh-CN"/>
+        </w:rPr>
+      </w:pPr>
+      <w:r>
+        <w:rPr>
+          <w:rFonts w:hint="eastAsia" w:ascii="Segoe UI" w:hAnsi="Segoe UI" w:cs="Segoe UI"/>
+          <w:b/>
+          <w:i w:val="0"/>
+          <w:caps w:val="0"/>
+          <w:color w:val="0000FF"/>
+          <w:spacing w:val="0"/>
+          <w:shd w:val="clear" w:fill="FFFFFF"/>
+          <w:lang w:val="en-US" w:eastAsia="zh-CN"/>
+        </w:rPr>
+        <w:t>优化</w:t>
+      </w:r>
+      <w:r>
+        <w:rPr>
+          <w:rFonts w:hint="default" w:ascii="Segoe UI" w:hAnsi="Segoe UI" w:eastAsia="Segoe UI" w:cs="Segoe UI"/>
+          <w:b/>
+          <w:i w:val="0"/>
+          <w:caps w:val="0"/>
+          <w:color w:val="0000FF"/>
+          <w:spacing w:val="0"/>
+          <w:shd w:val="clear" w:fill="FFFFFF"/>
+        </w:rPr>
+        <w:t>提交数据列表</w:t>
+      </w:r>
+      <w:r>
+        <w:rPr>
+          <w:rFonts w:hint="eastAsia" w:ascii="Segoe UI" w:hAnsi="Segoe UI" w:cs="Segoe UI"/>
+          <w:b/>
+          <w:i w:val="0"/>
+          <w:caps w:val="0"/>
+          <w:color w:val="0000FF"/>
+          <w:spacing w:val="0"/>
+          <w:shd w:val="clear" w:fill="FFFFFF"/>
+          <w:lang w:val="en-US" w:eastAsia="zh-CN"/>
+        </w:rPr>
+        <w:t>界面，</w:t>
+      </w:r>
+    </w:p>
+    <w:p>
+      <w:pPr>
+        <w:numPr>
+          <w:ilvl w:val="0"/>
+          <w:numId w:val="1"/>
+        </w:numPr>
+        <w:rPr>
+          <w:rFonts w:hint="eastAsia" w:ascii="Segoe UI" w:hAnsi="Segoe UI" w:cs="Segoe UI"/>
+          <w:b/>
+          <w:i w:val="0"/>
+          <w:caps w:val="0"/>
+          <w:color w:val="0000FF"/>
+          <w:spacing w:val="0"/>
+          <w:shd w:val="clear" w:fill="FFFFFF"/>
+          <w:lang w:val="en-US" w:eastAsia="zh-CN"/>
+        </w:rPr>
+      </w:pPr>
+      <w:r>
+        <w:rPr>
+          <w:rFonts w:hint="eastAsia" w:ascii="Segoe UI" w:hAnsi="Segoe UI" w:cs="Segoe UI"/>
+          <w:b/>
+          <w:i w:val="0"/>
+          <w:caps w:val="0"/>
+          <w:color w:val="0000FF"/>
+          <w:spacing w:val="0"/>
+          <w:shd w:val="clear" w:fill="FFFFFF"/>
+          <w:lang w:val="en-US" w:eastAsia="zh-CN"/>
+        </w:rPr>
+        <w:t>收起“测试数据提交”界面，用一个按钮替代：“无法连接？测试一下与网站的联通”</w:t>
+      </w:r>
+    </w:p>
+    <w:p>
+      <w:pPr>
+        <w:numPr>
+          <w:ilvl w:val="0"/>
+          <w:numId w:val="1"/>
+        </w:numPr>
+        <w:rPr>
+          <w:rFonts w:ascii="Segoe UI" w:hAnsi="Segoe UI" w:eastAsia="Segoe UI" w:cs="Segoe UI"/>
+          <w:b/>
+          <w:i w:val="0"/>
+          <w:caps w:val="0"/>
+          <w:color w:val="DC3545"/>
+          <w:spacing w:val="0"/>
+        </w:rPr>
+      </w:pPr>
+      <w:r>
+        <w:rPr>
+          <w:rFonts w:hint="eastAsia" w:ascii="Segoe UI" w:hAnsi="Segoe UI" w:cs="Segoe UI"/>
+          <w:b/>
+          <w:i w:val="0"/>
+          <w:caps w:val="0"/>
+          <w:color w:val="0000FF"/>
+          <w:spacing w:val="0"/>
+          <w:shd w:val="clear" w:fill="FFFFFF"/>
+          <w:lang w:val="en-US" w:eastAsia="zh-CN"/>
+        </w:rPr>
+        <w:t>原本右侧的</w:t>
+      </w:r>
+      <w:r>
+        <w:rPr>
+          <w:rFonts w:hint="default" w:ascii="Segoe UI" w:hAnsi="Segoe UI" w:eastAsia="Segoe UI" w:cs="Segoe UI"/>
+          <w:b/>
+          <w:i w:val="0"/>
+          <w:caps w:val="0"/>
+          <w:color w:val="DC3545"/>
+          <w:spacing w:val="0"/>
+          <w:shd w:val="clear" w:fill="FFFFFF"/>
+        </w:rPr>
+        <w:t>查看数据</w:t>
+      </w:r>
+      <w:r>
+        <w:rPr>
+          <w:rFonts w:hint="eastAsia" w:ascii="Segoe UI" w:hAnsi="Segoe UI" w:eastAsia="宋体" w:cs="Segoe UI"/>
+          <w:b/>
+          <w:i w:val="0"/>
+          <w:caps w:val="0"/>
+          <w:color w:val="DC3545"/>
+          <w:spacing w:val="0"/>
+          <w:shd w:val="clear" w:fill="FFFFFF"/>
+          <w:lang w:val="en-US" w:eastAsia="zh-CN"/>
+        </w:rPr>
+        <w:t>界面做的更加显眼，收起“</w:t>
+      </w:r>
+      <w:r>
+        <w:rPr>
+          <w:rStyle w:val="6"/>
+          <w:rFonts w:ascii="Segoe UI" w:hAnsi="Segoe UI" w:eastAsia="Segoe UI" w:cs="Segoe UI"/>
+          <w:b/>
+          <w:i w:val="0"/>
+          <w:caps w:val="0"/>
+          <w:color w:val="495057"/>
+          <w:spacing w:val="0"/>
+          <w:sz w:val="12"/>
+          <w:szCs w:val="12"/>
+          <w:shd w:val="clear" w:fill="FCFCFD"/>
+        </w:rPr>
+        <w:t>删改认证码</w:t>
+      </w:r>
+      <w:r>
+        <w:rPr>
+          <w:rFonts w:hint="eastAsia" w:ascii="Segoe UI" w:hAnsi="Segoe UI" w:eastAsia="宋体" w:cs="Segoe UI"/>
+          <w:b/>
+          <w:i w:val="0"/>
+          <w:caps w:val="0"/>
+          <w:color w:val="DC3545"/>
+          <w:spacing w:val="0"/>
+          <w:shd w:val="clear" w:fill="FFFFFF"/>
+          <w:lang w:val="en-US" w:eastAsia="zh-CN"/>
+        </w:rPr>
+        <w:t>”小卡片，用一个按钮“想要生成的网页可以删改数据？”替代</w:t>
+      </w:r>
+    </w:p>
+    <w:p>
+      <w:pPr>
+        <w:numPr>
+          <w:ilvl w:val="0"/>
+          <w:numId w:val="1"/>
+        </w:numPr>
+        <w:rPr>
+          <w:rFonts w:ascii="Segoe UI" w:hAnsi="Segoe UI" w:eastAsia="Segoe UI" w:cs="Segoe UI"/>
+          <w:b/>
+          <w:i w:val="0"/>
+          <w:caps w:val="0"/>
+          <w:color w:val="DC3545"/>
+          <w:spacing w:val="0"/>
+        </w:rPr>
+      </w:pPr>
+      <w:r>
+        <w:rPr>
+          <w:rFonts w:hint="eastAsia" w:ascii="Segoe UI" w:hAnsi="Segoe UI" w:eastAsia="宋体" w:cs="Segoe UI"/>
+          <w:b/>
+          <w:i w:val="0"/>
+          <w:caps w:val="0"/>
+          <w:color w:val="DC3545"/>
+          <w:spacing w:val="0"/>
+          <w:shd w:val="clear" w:fill="FFFFFF"/>
+          <w:lang w:val="en-US" w:eastAsia="zh-CN"/>
+        </w:rPr>
+        <w:t>以上两个按钮放在“查看数据”卡片的下方，按钮被点击时，下拉出原本的这两个功能卡片。</w:t>
+      </w:r>
+    </w:p>
+    <w:p>
+      <w:pPr>
+        <w:numPr>
+          <w:ilvl w:val="0"/>
+          <w:numId w:val="0"/>
+        </w:numPr>
+        <w:rPr>
+          <w:rFonts w:hint="default" w:ascii="Segoe UI" w:hAnsi="Segoe UI" w:cs="Segoe UI"/>
+          <w:b/>
+          <w:i w:val="0"/>
+          <w:caps w:val="0"/>
+          <w:color w:val="0000FF"/>
+          <w:spacing w:val="0"/>
+          <w:shd w:val="clear" w:fill="FFFFFF"/>
           <w:lang w:val="en-US" w:eastAsia="zh-CN"/>
         </w:rPr>
       </w:pPr>
@@ -299,6 +684,30 @@
     </w:sectPr>
   </w:body>
 </w:document>
+</file>
+
+<file path=word/numbering.xml><?xml version="1.0" encoding="utf-8"?>
+<w:numbering xmlns:wpc="http://schemas.microsoft.com/office/word/2010/wordprocessingCanvas" xmlns:mc="http://schemas.openxmlformats.org/markup-compatibility/2006" xmlns:o="urn:schemas-microsoft-com:office:office" xmlns:r="http://schemas.openxmlformats.org/officeDocument/2006/relationships" xmlns:m="http://schemas.openxmlformats.org/officeDocument/2006/math" xmlns:v="urn:schemas-microsoft-com:vml" xmlns:wp14="http://schemas.microsoft.com/office/word/2010/wordprocessingDrawing" xmlns:wp="http://schemas.openxmlformats.org/drawingml/2006/wordprocessingDrawing" xmlns:w10="urn:schemas-microsoft-com:office:word" xmlns:w="http://schemas.openxmlformats.org/wordprocessingml/2006/main" xmlns:w14="http://schemas.microsoft.com/office/word/2010/wordml" xmlns:wpg="http://schemas.microsoft.com/office/word/2010/wordprocessingGroup" xmlns:wpi="http://schemas.microsoft.com/office/word/2010/wordprocessingInk" xmlns:wne="http://schemas.microsoft.com/office/word/2006/wordml" xmlns:wps="http://schemas.microsoft.com/office/word/2010/wordprocessingShape" mc:Ignorable="w14 wp14">
+  <w:abstractNum w:abstractNumId="0">
+    <w:nsid w:val="9318F9AB"/>
+    <w:multiLevelType w:val="singleLevel"/>
+    <w:tmpl w:val="9318F9AB"/>
+    <w:lvl w:ilvl="0" w:tentative="0">
+      <w:start w:val="1"/>
+      <w:numFmt w:val="decimal"/>
+      <w:lvlText w:val="%1."/>
+      <w:lvlJc w:val="left"/>
+      <w:pPr>
+        <w:tabs>
+          <w:tab w:val="left" w:pos="312"/>
+        </w:tabs>
+      </w:pPr>
+    </w:lvl>
+  </w:abstractNum>
+  <w:num w:numId="1">
+    <w:abstractNumId w:val="0"/>
+  </w:num>
+</w:numbering>
 </file>
 
 <file path=word/styles.xml><?xml version="1.0" encoding="utf-8"?>
@@ -595,14 +1004,35 @@
       <w:sz w:val="44"/>
     </w:rPr>
   </w:style>
-  <w:style w:type="character" w:default="1" w:styleId="4">
+  <w:style w:type="paragraph" w:styleId="3">
+    <w:name w:val="heading 5"/>
+    <w:basedOn w:val="1"/>
+    <w:next w:val="1"/>
+    <w:semiHidden/>
+    <w:unhideWhenUsed/>
+    <w:qFormat/>
+    <w:uiPriority w:val="0"/>
+    <w:pPr>
+      <w:spacing w:before="0" w:beforeAutospacing="1" w:after="0" w:afterAutospacing="1"/>
+      <w:jc w:val="left"/>
+    </w:pPr>
+    <w:rPr>
+      <w:rFonts w:hint="eastAsia" w:ascii="宋体" w:hAnsi="宋体" w:eastAsia="宋体" w:cs="宋体"/>
+      <w:b/>
+      <w:kern w:val="0"/>
+      <w:sz w:val="20"/>
+      <w:szCs w:val="20"/>
+      <w:lang w:val="en-US" w:eastAsia="zh-CN" w:bidi="ar"/>
+    </w:rPr>
+  </w:style>
+  <w:style w:type="character" w:default="1" w:styleId="5">
     <w:name w:val="Default Paragraph Font"/>
     <w:semiHidden/>
     <w:unhideWhenUsed/>
     <w:qFormat/>
     <w:uiPriority w:val="1"/>
   </w:style>
-  <w:style w:type="table" w:default="1" w:styleId="3">
+  <w:style w:type="table" w:default="1" w:styleId="4">
     <w:name w:val="Normal Table"/>
     <w:semiHidden/>
     <w:unhideWhenUsed/>
@@ -617,9 +1047,18 @@
       </w:tblCellMar>
     </w:tblPr>
   </w:style>
-  <w:style w:type="character" w:styleId="5">
+  <w:style w:type="character" w:styleId="6">
+    <w:name w:val="Strong"/>
+    <w:basedOn w:val="5"/>
+    <w:qFormat/>
+    <w:uiPriority w:val="0"/>
+    <w:rPr>
+      <w:b/>
+    </w:rPr>
+  </w:style>
+  <w:style w:type="character" w:styleId="7">
     <w:name w:val="Hyperlink"/>
-    <w:basedOn w:val="4"/>
+    <w:basedOn w:val="5"/>
     <w:qFormat/>
     <w:uiPriority w:val="0"/>
     <w:rPr>
@@ -632,7 +1071,7 @@
       </w14:textFill>
     </w:rPr>
   </w:style>
-  <w:style w:type="paragraph" w:styleId="6">
+  <w:style w:type="paragraph" w:styleId="8">
     <w:name w:val="List Paragraph"/>
     <w:basedOn w:val="1"/>
     <w:unhideWhenUsed/>
@@ -642,9 +1081,9 @@
       <w:ind w:firstLine="420" w:firstLineChars="200"/>
     </w:pPr>
   </w:style>
-  <w:style w:type="character" w:customStyle="1" w:styleId="7">
+  <w:style w:type="character" w:customStyle="1" w:styleId="9">
     <w:name w:val="Unresolved Mention"/>
-    <w:basedOn w:val="4"/>
+    <w:basedOn w:val="5"/>
     <w:semiHidden/>
     <w:unhideWhenUsed/>
     <w:qFormat/>

</xml_diff>